<commit_message>
Now the sistem is 100% focused on mails management
</commit_message>
<xml_diff>
--- a/static/files/template.docx
+++ b/static/files/template.docx
@@ -4,6 +4,45 @@
   <w:body>
     <w:p>
       <w:pPr>
+        <w:rPr>
+          <w:b/>
+          <w:bCs/>
+          <w:sz w:val="16"/>
+          <w:szCs w:val="16"/>
+        </w:rPr>
+      </w:pPr>
+      <w:r>
+        <w:rPr>
+          <w:b/>
+          <w:bCs/>
+          <w:sz w:val="16"/>
+          <w:szCs w:val="16"/>
+        </w:rPr>
+        <w:t xml:space="preserve">ID: </w:t>
+      </w:r>
+      <w:proofErr w:type="gramStart"/>
+      <w:r>
+        <w:rPr>
+          <w:b/>
+          <w:bCs/>
+          <w:sz w:val="16"/>
+          <w:szCs w:val="16"/>
+        </w:rPr>
+        <w:t>{{ IDCODE</w:t>
+      </w:r>
+      <w:proofErr w:type="gramEnd"/>
+      <w:r>
+        <w:rPr>
+          <w:b/>
+          <w:bCs/>
+          <w:sz w:val="16"/>
+          <w:szCs w:val="16"/>
+        </w:rPr>
+        <w:t xml:space="preserve"> }}</w:t>
+      </w:r>
+    </w:p>
+    <w:p>
+      <w:pPr>
         <w:ind w:left="-1276" w:firstLine="1134"/>
         <w:jc w:val="center"/>
         <w:rPr>
@@ -22,7 +61,7 @@
           <w:szCs w:val="40"/>
           <w:u w:val="single"/>
         </w:rPr>
-        <w:t>Devolução</w:t>
+        <w:t>Termo de Devolução</w:t>
       </w:r>
       <w:r>
         <w:rPr>
@@ -143,7 +182,7 @@
           <w:sz w:val="28"/>
           <w:szCs w:val="28"/>
         </w:rPr>
-        <w:t>esponsável da</w:t>
+        <w:t>esponsável</w:t>
       </w:r>
       <w:r>
         <w:rPr>
@@ -151,6 +190,14 @@
           <w:sz w:val="28"/>
           <w:szCs w:val="28"/>
         </w:rPr>
+        <w:t>,</w:t>
+      </w:r>
+      <w:r>
+        <w:rPr>
+          <w:bCs/>
+          <w:sz w:val="28"/>
+          <w:szCs w:val="28"/>
+        </w:rPr>
         <w:t xml:space="preserve"> </w:t>
       </w:r>
       <w:r>
@@ -159,7 +206,15 @@
           <w:sz w:val="28"/>
           <w:szCs w:val="28"/>
         </w:rPr>
-        <w:t>Recepção</w:t>
+        <w:t>Recep</w:t>
+      </w:r>
+      <w:r>
+        <w:rPr>
+          <w:b/>
+          <w:sz w:val="28"/>
+          <w:szCs w:val="28"/>
+        </w:rPr>
+        <w:t>cionista</w:t>
       </w:r>
       <w:r>
         <w:rPr>
@@ -1256,100 +1311,6 @@
           </w:p>
         </w:tc>
       </w:tr>
-      <w:tr>
-        <w:tc>
-          <w:tcPr>
-            <w:tcW w:w="2547" w:type="dxa"/>
-          </w:tcPr>
-          <w:p>
-            <w:pPr>
-              <w:jc w:val="center"/>
-              <w:rPr>
-                <w:bCs/>
-                <w:sz w:val="24"/>
-                <w:szCs w:val="24"/>
-              </w:rPr>
-            </w:pPr>
-          </w:p>
-        </w:tc>
-        <w:tc>
-          <w:tcPr>
-            <w:tcW w:w="4678" w:type="dxa"/>
-          </w:tcPr>
-          <w:p>
-            <w:pPr>
-              <w:jc w:val="center"/>
-              <w:rPr>
-                <w:bCs/>
-                <w:sz w:val="24"/>
-                <w:szCs w:val="24"/>
-              </w:rPr>
-            </w:pPr>
-          </w:p>
-        </w:tc>
-        <w:tc>
-          <w:tcPr>
-            <w:tcW w:w="2551" w:type="dxa"/>
-          </w:tcPr>
-          <w:p>
-            <w:pPr>
-              <w:jc w:val="center"/>
-              <w:rPr>
-                <w:bCs/>
-                <w:sz w:val="24"/>
-                <w:szCs w:val="24"/>
-              </w:rPr>
-            </w:pPr>
-          </w:p>
-        </w:tc>
-      </w:tr>
-      <w:tr>
-        <w:tc>
-          <w:tcPr>
-            <w:tcW w:w="2547" w:type="dxa"/>
-          </w:tcPr>
-          <w:p>
-            <w:pPr>
-              <w:jc w:val="center"/>
-              <w:rPr>
-                <w:bCs/>
-                <w:sz w:val="24"/>
-                <w:szCs w:val="24"/>
-              </w:rPr>
-            </w:pPr>
-          </w:p>
-        </w:tc>
-        <w:tc>
-          <w:tcPr>
-            <w:tcW w:w="4678" w:type="dxa"/>
-          </w:tcPr>
-          <w:p>
-            <w:pPr>
-              <w:jc w:val="center"/>
-              <w:rPr>
-                <w:bCs/>
-                <w:sz w:val="24"/>
-                <w:szCs w:val="24"/>
-              </w:rPr>
-            </w:pPr>
-          </w:p>
-        </w:tc>
-        <w:tc>
-          <w:tcPr>
-            <w:tcW w:w="2551" w:type="dxa"/>
-          </w:tcPr>
-          <w:p>
-            <w:pPr>
-              <w:jc w:val="center"/>
-              <w:rPr>
-                <w:bCs/>
-                <w:sz w:val="24"/>
-                <w:szCs w:val="24"/>
-              </w:rPr>
-            </w:pPr>
-          </w:p>
-        </w:tc>
-      </w:tr>
     </w:tbl>
     <w:p>
       <w:pPr>
@@ -1363,16 +1324,16 @@
           <w:noProof/>
         </w:rPr>
         <w:drawing>
-          <wp:anchor distT="0" distB="0" distL="114300" distR="114300" simplePos="0" relativeHeight="251689984" behindDoc="0" locked="1" layoutInCell="1" allowOverlap="1" wp14:anchorId="34E9E1B8" wp14:editId="5E68BF6E">
+          <wp:anchor distT="0" distB="0" distL="114300" distR="114300" simplePos="0" relativeHeight="251689984" behindDoc="0" locked="1" layoutInCell="1" allowOverlap="1" wp14:anchorId="34E9E1B8" wp14:editId="5F2DF947">
             <wp:simplePos x="0" y="0"/>
             <wp:positionH relativeFrom="margin">
-              <wp:align>center</wp:align>
+              <wp:posOffset>3036570</wp:posOffset>
             </wp:positionH>
             <wp:positionV relativeFrom="page">
-              <wp:posOffset>1839595</wp:posOffset>
+              <wp:posOffset>2032000</wp:posOffset>
             </wp:positionV>
-            <wp:extent cx="576000" cy="576000"/>
-            <wp:effectExtent l="0" t="0" r="0" b="0"/>
+            <wp:extent cx="571500" cy="582295"/>
+            <wp:effectExtent l="0" t="0" r="0" b="8255"/>
             <wp:wrapNone/>
             <wp:docPr id="1" name="Picture 1"/>
             <wp:cNvGraphicFramePr>
@@ -1401,7 +1362,7 @@
                   <pic:spPr bwMode="auto">
                     <a:xfrm>
                       <a:off x="0" y="0"/>
-                      <a:ext cx="576000" cy="576000"/>
+                      <a:ext cx="571500" cy="582295"/>
                     </a:xfrm>
                     <a:prstGeom prst="rect">
                       <a:avLst/>
@@ -1440,13 +1401,13 @@
         <mc:AlternateContent>
           <mc:Choice Requires="wps">
             <w:drawing>
-              <wp:anchor distT="0" distB="0" distL="114300" distR="114300" simplePos="0" relativeHeight="251658240" behindDoc="0" locked="1" layoutInCell="1" allowOverlap="1" wp14:anchorId="0DCDF990" wp14:editId="6387D8DF">
+              <wp:anchor distT="0" distB="0" distL="114300" distR="114300" simplePos="0" relativeHeight="251658240" behindDoc="0" locked="1" layoutInCell="1" allowOverlap="1" wp14:anchorId="0DCDF990" wp14:editId="7536821E">
                 <wp:simplePos x="0" y="0"/>
                 <wp:positionH relativeFrom="margin">
-                  <wp:posOffset>5938</wp:posOffset>
+                  <wp:posOffset>5715</wp:posOffset>
                 </wp:positionH>
                 <wp:positionV relativeFrom="page">
-                  <wp:posOffset>2090057</wp:posOffset>
+                  <wp:posOffset>2299335</wp:posOffset>
                 </wp:positionV>
                 <wp:extent cx="2743200" cy="0"/>
                 <wp:effectExtent l="0" t="0" r="0" b="0"/>
@@ -1501,11 +1462,11 @@
           </mc:Choice>
           <mc:Fallback>
             <w:pict>
-              <v:shapetype w14:anchorId="49142A12" id="_x0000_t32" coordsize="21600,21600" o:spt="32" o:oned="t" path="m,l21600,21600e" filled="f">
+              <v:shapetype w14:anchorId="6B6B9A31" id="_x0000_t32" coordsize="21600,21600" o:spt="32" o:oned="t" path="m,l21600,21600e" filled="f">
                 <v:path arrowok="t" fillok="f" o:connecttype="none"/>
                 <o:lock v:ext="edit" shapetype="t"/>
               </v:shapetype>
-              <v:shape id="AutoShape 2" o:spid="_x0000_s1026" type="#_x0000_t32" style="position:absolute;margin-left:.45pt;margin-top:164.55pt;width:3in;height:0;z-index:251658240;visibility:visible;mso-wrap-style:square;mso-width-percent:0;mso-height-percent:0;mso-wrap-distance-left:9pt;mso-wrap-distance-top:0;mso-wrap-distance-right:9pt;mso-wrap-distance-bottom:0;mso-position-horizontal:absolute;mso-position-horizontal-relative:margin;mso-position-vertical:absolute;mso-position-vertical-relative:page;mso-width-percent:0;mso-height-percent:0;mso-width-relative:page;mso-height-relative:page" o:gfxdata="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">
+              <v:shape id="AutoShape 2" o:spid="_x0000_s1026" type="#_x0000_t32" style="position:absolute;margin-left:.45pt;margin-top:181.05pt;width:3in;height:0;z-index:251658240;visibility:visible;mso-wrap-style:square;mso-width-percent:0;mso-height-percent:0;mso-wrap-distance-left:9pt;mso-wrap-distance-top:0;mso-wrap-distance-right:9pt;mso-wrap-distance-bottom:0;mso-position-horizontal:absolute;mso-position-horizontal-relative:margin;mso-position-vertical:absolute;mso-position-vertical-relative:page;mso-width-percent:0;mso-height-percent:0;mso-width-relative:page;mso-height-relative:page" o:gfxdata="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">
                 <w10:wrap anchorx="margin" anchory="page"/>
                 <w10:anchorlock/>
               </v:shape>
@@ -1525,13 +1486,13 @@
         <mc:AlternateContent>
           <mc:Choice Requires="wps">
             <w:drawing>
-              <wp:anchor distT="0" distB="0" distL="114300" distR="114300" simplePos="0" relativeHeight="251660288" behindDoc="0" locked="1" layoutInCell="1" allowOverlap="1" wp14:anchorId="3A1E356B" wp14:editId="3E966736">
+              <wp:anchor distT="0" distB="0" distL="114300" distR="114300" simplePos="0" relativeHeight="251660288" behindDoc="0" locked="1" layoutInCell="1" allowOverlap="1" wp14:anchorId="3A1E356B" wp14:editId="472AAE63">
                 <wp:simplePos x="0" y="0"/>
                 <wp:positionH relativeFrom="margin">
-                  <wp:posOffset>3901044</wp:posOffset>
+                  <wp:posOffset>3900805</wp:posOffset>
                 </wp:positionH>
                 <wp:positionV relativeFrom="page">
-                  <wp:posOffset>2090057</wp:posOffset>
+                  <wp:posOffset>2299335</wp:posOffset>
                 </wp:positionV>
                 <wp:extent cx="2743200" cy="0"/>
                 <wp:effectExtent l="0" t="0" r="0" b="0"/>
@@ -1586,7 +1547,7 @@
           </mc:Choice>
           <mc:Fallback>
             <w:pict>
-              <v:shape w14:anchorId="34005468" id="AutoShape 4" o:spid="_x0000_s1026" type="#_x0000_t32" style="position:absolute;margin-left:307.15pt;margin-top:164.55pt;width:3in;height:0;z-index:251660288;visibility:visible;mso-wrap-style:square;mso-width-percent:0;mso-height-percent:0;mso-wrap-distance-left:9pt;mso-wrap-distance-top:0;mso-wrap-distance-right:9pt;mso-wrap-distance-bottom:0;mso-position-horizontal:absolute;mso-position-horizontal-relative:margin;mso-position-vertical:absolute;mso-position-vertical-relative:page;mso-width-percent:0;mso-height-percent:0;mso-width-relative:page;mso-height-relative:page" o:gfxdata="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">
+              <v:shape w14:anchorId="5D2C6AA5" id="AutoShape 4" o:spid="_x0000_s1026" type="#_x0000_t32" style="position:absolute;margin-left:307.15pt;margin-top:181.05pt;width:3in;height:0;z-index:251660288;visibility:visible;mso-wrap-style:square;mso-width-percent:0;mso-height-percent:0;mso-wrap-distance-left:9pt;mso-wrap-distance-top:0;mso-wrap-distance-right:9pt;mso-wrap-distance-bottom:0;mso-position-horizontal:absolute;mso-position-horizontal-relative:margin;mso-position-vertical:absolute;mso-position-vertical-relative:page;mso-width-percent:0;mso-height-percent:0;mso-width-relative:page;mso-height-relative:page" o:gfxdata="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">
                 <w10:wrap anchorx="margin" anchory="page"/>
                 <w10:anchorlock/>
               </v:shape>
@@ -2964,7 +2925,6 @@
         <w:docPartUnique/>
       </w:docPartObj>
     </w:sdtPr>
-    <w:sdtEndPr/>
     <w:sdtContent>
       <w:p>
         <w:pPr>

</xml_diff>